<commit_message>
feat: add Kimi/Qwen3.5VL agents, fix duplicate task IDs in interactive eval list, improve stats script
- Add Kimi K2.5 agent (mm_agents/kimi/) and run script (run_multienv_kimi_k25.py)
- Add Qwen3.5-VL agent (mm_agents/qwen35vl_agent.py) and run script (run_multienv_qwen35vl.py)
- Add corresponding taiji launch scripts for Kimi and Qwen3.5
- Fix example_final_interactive_all.json: remove 19 duplicate task IDs (ui_gen domain removed, L3_interactive_inkscape_correction_001 deduped from interactive_xt)
- Fix stats_result_by_software_and_level.py: add libreoffice_multi_njc and multiapp aliases so interactive_multiapp_* tasks are counted correctly
- Update lib_run_single.py, lib_run_interactive.py, taiji start scripts
- Update LibreOffice calc/impr/writ asset files

Co-Authored-By: Claude Sonnet 4.6 (1M context) <noreply@anthropic.com>
</commit_message>
<xml_diff>
--- a/assets/libreoffice_writ_njc/0dfb76bb-277e-46a8-9dfe-30c6370f6a08/RemotePolicy_L2_12.docx
+++ b/assets/libreoffice_writ_njc/0dfb76bb-277e-46a8-9dfe-30c6370f6a08/RemotePolicy_L2_12.docx
@@ -34,18 +34,18 @@
     <w:p>
       <w:pPr>
         <w:pStyle w:val="Heading1"/>
-        <w:rPr/>
-      </w:pPr>
-      <w:r>
-        <w:rPr/>
-        <w:t xml:space="preserve">1. </w:t>
-      </w:r>
+        <w:rPr>
+          <w:b/>
+          <w:b/>
+          <w:bCs/>
+        </w:rPr>
+      </w:pPr>
       <w:r>
         <w:rPr>
-          <w:b w:val="false"/>
-          <w:bCs w:val="false"/>
+          <w:b/>
+          <w:bCs/>
         </w:rPr>
-        <w:t>Purpose</w:t>
+        <w:t>1. Purpose</w:t>
       </w:r>
     </w:p>
     <w:p>
@@ -61,18 +61,18 @@
     <w:p>
       <w:pPr>
         <w:pStyle w:val="Heading1"/>
-        <w:rPr/>
-      </w:pPr>
-      <w:r>
-        <w:rPr/>
-        <w:t xml:space="preserve">2. </w:t>
-      </w:r>
+        <w:rPr>
+          <w:b/>
+          <w:b/>
+          <w:bCs/>
+        </w:rPr>
+      </w:pPr>
       <w:r>
         <w:rPr>
-          <w:b w:val="false"/>
-          <w:bCs w:val="false"/>
+          <w:b/>
+          <w:bCs/>
         </w:rPr>
-        <w:t>Eligibility</w:t>
+        <w:t>2. Eligibility</w:t>
       </w:r>
     </w:p>
     <w:p>
@@ -88,18 +88,18 @@
     <w:p>
       <w:pPr>
         <w:pStyle w:val="Heading1"/>
-        <w:rPr/>
-      </w:pPr>
-      <w:r>
-        <w:rPr/>
-        <w:t xml:space="preserve">3. </w:t>
-      </w:r>
+        <w:rPr>
+          <w:b/>
+          <w:b/>
+          <w:bCs/>
+        </w:rPr>
+      </w:pPr>
       <w:r>
         <w:rPr>
-          <w:b w:val="false"/>
-          <w:bCs w:val="false"/>
+          <w:b/>
+          <w:bCs/>
         </w:rPr>
-        <w:t>Work Schedule</w:t>
+        <w:t>3. Work Schedule</w:t>
       </w:r>
     </w:p>
     <w:p>
@@ -109,24 +109,24 @@
       </w:pPr>
       <w:r>
         <w:rPr/>
-        <w:t>Remote employees must maintain regular working hours from 9 AM to 5 PM in their local time zone. Core collaboration hours are 10 AM to 3 PM Eastern Time. Employees must be available during core hours for meetings and communication.</w:t>
+        <w:t>Hybrid employees must maintain regular working hours from 9 AM to 5 PM in their local time zone. Core collaboration hours are 10 AM to 3 PM Eastern Time. Employees must be available during core hours for meetings and communication.</w:t>
       </w:r>
     </w:p>
     <w:p>
       <w:pPr>
         <w:pStyle w:val="Heading1"/>
-        <w:rPr/>
-      </w:pPr>
-      <w:r>
-        <w:rPr/>
-        <w:t xml:space="preserve">4. </w:t>
-      </w:r>
+        <w:rPr>
+          <w:b/>
+          <w:b/>
+          <w:bCs/>
+        </w:rPr>
+      </w:pPr>
       <w:r>
         <w:rPr>
-          <w:b w:val="false"/>
-          <w:bCs w:val="false"/>
+          <w:b/>
+          <w:bCs/>
         </w:rPr>
-        <w:t>Equipment and Security</w:t>
+        <w:t>4. Equipment and Security</w:t>
       </w:r>
     </w:p>
     <w:p>
@@ -142,18 +142,18 @@
     <w:p>
       <w:pPr>
         <w:pStyle w:val="Heading1"/>
-        <w:rPr/>
-      </w:pPr>
-      <w:r>
-        <w:rPr/>
-        <w:t xml:space="preserve">5. </w:t>
-      </w:r>
+        <w:rPr>
+          <w:b/>
+          <w:b/>
+          <w:bCs/>
+        </w:rPr>
+      </w:pPr>
       <w:r>
         <w:rPr>
-          <w:b w:val="false"/>
-          <w:bCs w:val="false"/>
+          <w:b/>
+          <w:bCs/>
         </w:rPr>
-        <w:t>Communication Standards</w:t>
+        <w:t>5. Communication Standards</w:t>
       </w:r>
     </w:p>
     <w:p>

</xml_diff>